<commit_message>
SP2: corrige integridad del borrador — banco (E5/E6) NO dado por hecho
El Resumen/Abstract y §6 afirmaban en pasado pruebas de banco y latencia que
no existen (HW sin montar), contradiciendo §5.5. Ahora: lo realizado es solo
la simulación determinista (E1-E4); el banco queda como continuación/pendiente
de forma consistente en todo el documento (§4.4 'por obtener', no 'obtenidas').
§5.3 atribuye el error al jugador simulado, no al sistema. §6 suaviza 'viable'.
docx regenerado. Además: documenta en FuenteTCP que la reconexión es solo de
transporte (no re-sincroniza modo/nivel).

Co-Authored-By: Claude Opus 4.8 (1M context) <noreply@anthropic.com>
</commit_message>
<xml_diff>
--- a/docs/articulo_honesto_borrador.docx
+++ b/docs/articulo_honesto_borrador.docx
@@ -79,7 +79,7 @@
         <w:pStyle w:val="BodyText"/>
       </w:pPr>
       <w:r>
-        <w:t xml:space="preserve">El síndrome de Down es una condición genética la cual se relaciona con alteraciones en el desarrollo motor y cognitivo, especialmente en áreas como el equilibrio, la coordinación, la memoria de trabajo y la planificación motora. Es por esto que estas dificultades pueden limitar la autonomía y la participación activa de los niños en espacios educativos y terapéuticos, por lo que es necesario implementar estrategias de intervención innovadoras que complementen y ayuden a las terapias tradicionales. Cabe resaltar que las tecnologías interactivas y los juegos se han convertido en una herramienta prometedora para la estimulación multisensorial y el fortalecimiento de habilidades cognitivas y motoras. Teniendo en cuenta lo mencionado anteriormente, este artículo presenta el diseño y desarrollo de un tapete interactivo multisensorial que combina secuencias de luces y sonidos como herramienta de apoyo terapéutico para niños con síndrome de Down. El sistema integra sensores de presión, iluminación LED y un microcontrolador ESP32, permitiendo la ejecución de dinámicas de juego orientadas a estimular la memoria de trabajo, la planificación motora, la velocidad de respuesta y el equilibrio. Adicionalmente, se incorpora un software de monitoreo en PC que registra variables como tiempos de respuesta, aciertos y errores, facilitando el análisis del comportamiento funcional del prototipo. La validación del sistema se realizó mediante dos estrategias complementarias: una simulación determinista de la lógica de juego —ejecutando un jugador simulado contra el mismo núcleo de software que gobierna el prototipo— y pruebas funcionales de banco sobre el hardware, enfocándose en la reproducibilidad, el comportamiento de la dificultad adaptativa, la estabilidad y la latencia del lazo de interacción, sin realizar pruebas con pacientes ni mediciones de impacto clínico. Los resultados evidencian que el tapete interactivo es técnicamente viable y que su lógica de dificultad adaptativa responde de forma coherente al desempeño, destacando su potencial como herramienta tecnológica complementaria para apoyar procesos terapéuticos en niños con síndrome de Down.</w:t>
+        <w:t xml:space="preserve">El síndrome de Down es una condición genética la cual se relaciona con alteraciones en el desarrollo motor y cognitivo, especialmente en áreas como el equilibrio, la coordinación, la memoria de trabajo y la planificación motora. Es por esto que estas dificultades pueden limitar la autonomía y la participación activa de los niños en espacios educativos y terapéuticos, por lo que es necesario implementar estrategias de intervención innovadoras que complementen y ayuden a las terapias tradicionales. Cabe resaltar que las tecnologías interactivas y los juegos se han convertido en una herramienta prometedora para la estimulación multisensorial y el fortalecimiento de habilidades cognitivas y motoras. Teniendo en cuenta lo mencionado anteriormente, este artículo presenta el diseño y desarrollo de un tapete interactivo multisensorial que combina secuencias de luces y sonidos como herramienta de apoyo terapéutico para niños con síndrome de Down. El sistema integra sensores de presión, iluminación LED y un microcontrolador ESP32, permitiendo la ejecución de dinámicas de juego orientadas a estimular la memoria de trabajo, la planificación motora, la velocidad de respuesta y el equilibrio. Adicionalmente, se incorpora un software de monitoreo en PC que registra variables como tiempos de respuesta, aciertos y errores, facilitando el análisis del comportamiento funcional del prototipo. La validación de la lógica del sistema se realizó mediante una simulación determinista —ejecutando un jugador simulado contra el mismo núcleo de software que gobierna el prototipo—, enfocándose en la reproducibilidad y en el comportamiento de la dificultad adaptativa, sin realizar pruebas con pacientes ni mediciones de impacto clínico; la validación funcional de banco sobre el hardware (latencia del lazo de interacción y fiabilidad de detección de los sensores) se plantea como continuación, una vez completado el montaje del prototipo. Los resultados de simulación evidencian que la lógica de dificultad adaptativa responde de forma coherente al desempeño, lo que respalda la viabilidad técnica del sistema y destaca su potencial como herramienta tecnológica complementaria para apoyar procesos terapéuticos en niños con síndrome de Down.</w:t>
       </w:r>
     </w:p>
     <w:p>
@@ -119,7 +119,7 @@
         <w:pStyle w:val="BodyText"/>
       </w:pPr>
       <w:r>
-        <w:t xml:space="preserve">Down syndrome is a genetic condition associated with alterations in motor and cognitive development, particularly in areas such as balance, coordination, working memory, and motor planning. These difficulties can limit children’s autonomy and active participation in educational and therapeutic settings, which makes it necessary to implement innovative intervention strategies that complement traditional therapies. Interactive technologies and serious games have emerged as a promising tool for multisensory stimulation and for strengthening cognitive and motor skills. This article presents the design and development of a multisensory interactive mat that combines light and sound sequences as a therapeutic support tool for children with Down syndrome. The system integrates pressure sensors, LED lighting, and an ESP32 microcontroller, enabling game dynamics aimed at stimulating working memory, motor planning, response speed, and balance. A PC monitoring application was also incorporated to record variables such as response times, hits, and errors, supporting the analysis of the prototype’s functional behavior. The system was validated through two complementary strategies: a deterministic simulation of the game logic —running a simulated player against the same software core that governs the prototype— and functional bench tests on the hardware, focusing on reproducibility, adaptive-difficulty behavior, stability, and interaction-loop latency, without conducting tests with patients or clinical-impact measurements. Results show that the interactive mat is technically feasible and that its adaptive-difficulty logic responds coherently to performance, highlighting its potential as a complementary technological tool to support therapeutic processes in children with Down syndrome.</w:t>
+        <w:t xml:space="preserve">Down syndrome is a genetic condition associated with alterations in motor and cognitive development, particularly in areas such as balance, coordination, working memory, and motor planning. These difficulties can limit children’s autonomy and active participation in educational and therapeutic settings, which makes it necessary to implement innovative intervention strategies that complement traditional therapies. Interactive technologies and serious games have emerged as a promising tool for multisensory stimulation and for strengthening cognitive and motor skills. This article presents the design and development of a multisensory interactive mat that combines light and sound sequences as a therapeutic support tool for children with Down syndrome. The system integrates pressure sensors, LED lighting, and an ESP32 microcontroller, enabling game dynamics aimed at stimulating working memory, motor planning, response speed, and balance. A PC monitoring application was also incorporated to record variables such as response times, hits, and errors, supporting the analysis of the prototype’s functional behavior. The system logic was validated through a deterministic simulation —running a simulated player against the same software core that governs the prototype—, focusing on reproducibility and adaptive-difficulty behavior, without conducting tests with patients or clinical-impact measurements; functional bench validation on the hardware (interaction-loop latency and sensor-detection reliability) is planned as a continuation, once the prototype assembly is completed. The simulation results show that the adaptive-difficulty logic responds coherently to performance, supporting the technical feasibility of the system and highlighting its potential as a complementary technological tool to support therapeutic processes in children with Down syndrome.</w:t>
       </w:r>
     </w:p>
     <w:p>
@@ -826,7 +826,7 @@
         <w:pStyle w:val="BodyText"/>
       </w:pPr>
       <w:r>
-        <w:t xml:space="preserve">Los parámetros de validación se resumen en seis evidencias: la reproducibilidad de la lógica (E1), el seguimiento de la dificultad adaptativa frente al desempeño (E2), el comportamiento por nivel (E3) y la evolución del nivel entre sesiones simuladas (E4) —obtenidas por simulación determinista—, y la latencia del lazo de interacción (E5) y la fiabilidad de detección de los sensores (E6) —obtenidas en banco—. La evaluación del impacto terapéutico con pacientes, que requeriría un protocolo clínico con aprobación de comité de ética, consentimiento informado y seguimiento longitudinal, no se aborda en este trabajo y se plantea como trabajo futuro (sección 6); el alcance se centra en la viabilidad técnica y funcional del dispositivo.</w:t>
+        <w:t xml:space="preserve">Los parámetros de validación se resumen en seis evidencias: la reproducibilidad de la lógica (E1), el seguimiento de la dificultad adaptativa frente al desempeño (E2), el comportamiento por nivel (E3) y la evolución del nivel entre sesiones simuladas (E4) —obtenidas por simulación determinista—, y la latencia del lazo de interacción (E5) y la fiabilidad de detección de los sensores (E6) —por obtener en banco—. La evaluación del impacto terapéutico con pacientes, que requeriría un protocolo clínico con aprobación de comité de ética, consentimiento informado y seguimiento longitudinal, no se aborda en este trabajo y se plantea como trabajo futuro (sección 6); el alcance se centra en la viabilidad técnica y funcional del dispositivo.</w:t>
       </w:r>
     </w:p>
     <w:p>
@@ -1042,7 +1042,7 @@
         <w:pStyle w:val="BodyText"/>
       </w:pPr>
       <w:r>
-        <w:t xml:space="preserve">Para una habilidad fija del 80 %, se evaluaron los cuatro niveles del modo de velocidad. El número de rondas por sesión crece con el nivel (5, 8, 10 y 12 rondas para los niveles 1 a 4), mientras que el número de errores se mantiene bajo y estable (un error por sesión en todos los niveles), confirmando que el incremento de dificultad se traduce en sesiones más largas sin degradar la capacidad de respuesta del sistema (Figura 2, Tabla 2).</w:t>
+        <w:t xml:space="preserve">Para una habilidad fija del 80 %, se evaluaron los cuatro niveles del modo de velocidad. El número de rondas por sesión crece con el nivel (5, 8, 10 y 12 rondas para los niveles 1 a 4), mientras que el desempeño del jugador simulado se mantiene estable (un error por sesión en los cuatro niveles, acorde con la habilidad fijada). Esto confirma que el nivel controla de forma predecible la longitud y la exigencia de la sesión, manteniendo constante la mecánica de juego (Figura 2, Tabla 2).</w:t>
       </w:r>
     </w:p>
     <w:p>
@@ -1741,7 +1741,7 @@
         <w:pStyle w:val="BodyText"/>
       </w:pPr>
       <w:r>
-        <w:t xml:space="preserve">No obstante, es importante reconocer las limitaciones de este trabajo. La validación se realizó mediante simulación determinista de la lógica de juego y pruebas de banco del dispositivo, sin pruebas con usuarios; por tanto, no es posible afirmar nada sobre la experiencia de uso real, la aceptación por parte de los niños ni el impacto cognitivo o motor del sistema. La evidencia de simulación se obtuvo, además, para el modo de velocidad de respuesta; los modos de memoria y equilibrio, aunque implementados, requieren una validación análoga. Finalmente, las evidencias de banco (latencia y fiabilidad de detección) dependen de la finalización del montaje físico.</w:t>
+        <w:t xml:space="preserve">No obstante, es importante reconocer las limitaciones de este trabajo. La validación se realizó mediante simulación determinista de la lógica de juego, sin pruebas con usuarios; por tanto, no es posible afirmar nada sobre la experiencia de uso real, la aceptación por parte de los niños ni el impacto cognitivo o motor del sistema. La evidencia de simulación se obtuvo, además, para el modo de velocidad de respuesta; los modos de memoria y equilibrio, aunque implementados, requieren una validación análoga. Finalmente, las evidencias de banco (latencia y fiabilidad de detección) dependen de la finalización del montaje físico.</w:t>
       </w:r>
     </w:p>
     <w:p>
@@ -1757,7 +1757,7 @@
         <w:pStyle w:val="BodyText"/>
       </w:pPr>
       <w:r>
-        <w:t xml:space="preserve">En conjunto, los resultados respaldan la pregunta de investigación planteada: los elementos clave para la efectividad del tapete como herramienta de apoyo terapéutico residen en la integración multisensorial coherente (luces y sonidos sincronizados con la acción), la retroalimentación inmediata, la adaptabilidad de los niveles de dificultad y el registro objetivo del desempeño, factores que, en conjunto, hacen del dispositivo una herramienta tecnológica complementaria viable para acompañar los procesos terapéuticos en niños con síndrome de Down. El proyecto, además, se alinea con los Objetivos de Desarrollo Sostenible de la ONU, particularmente con el ODS 3 (Salud y Bienestar) y el ODS 10 (Reducción de las Desigualdades), al promover la atención especializada y la inclusión social de esta población (Objetivos de Desarrollo Sostenible, s.f.).</w:t>
+        <w:t xml:space="preserve">En conjunto, los resultados respaldan la pregunta de investigación planteada: los elementos clave para la efectividad del tapete como herramienta de apoyo terapéutico residen en la integración multisensorial coherente (luces y sonidos sincronizados con la acción), la retroalimentación inmediata, la adaptabilidad de los niveles de dificultad y el registro objetivo del desempeño, factores que, en conjunto, posicionan al dispositivo como una herramienta tecnológica complementaria con potencial para acompañar los procesos terapéuticos en niños con síndrome de Down, sujeto a la validación funcional de banco y a la posterior evaluación con usuarios. El proyecto, además, se alinea con los Objetivos de Desarrollo Sostenible de la ONU, particularmente con el ODS 3 (Salud y Bienestar) y el ODS 10 (Reducción de las Desigualdades), al promover la atención especializada y la inclusión social de esta población (Objetivos de Desarrollo Sostenible, s.f.).</w:t>
       </w:r>
     </w:p>
     <w:p>

</xml_diff>